<commit_message>
research: freeze canonical metrics after Round 3 consistency audit
Co-authored-by: Cursor <cursoragent@cursor.com>
</commit_message>
<xml_diff>
--- a/docs/VaaniQ_IEEE_Research_Paper_Final.docx
+++ b/docs/VaaniQ_IEEE_Research_Paper_Final.docx
@@ -3194,7 +3194,7 @@
                 <w:b w:val="0"/>
                 <w:sz w:val="15"/>
               </w:rPr>
-              <w:t>93.7%</w:t>
+              <w:t>91.6%</w:t>
             </w:r>
           </w:p>
         </w:tc>
@@ -3348,7 +3348,7 @@
                 <w:b w:val="0"/>
                 <w:sz w:val="15"/>
               </w:rPr>
-              <w:t>78.8%</w:t>
+              <w:t>76.6%</w:t>
             </w:r>
           </w:p>
         </w:tc>
@@ -3386,7 +3386,7 @@
                 <w:b w:val="0"/>
                 <w:sz w:val="15"/>
               </w:rPr>
-              <w:t>93.7%</w:t>
+              <w:t>91.6%</w:t>
             </w:r>
           </w:p>
         </w:tc>

</xml_diff>